<commit_message>
M23: record commit hash ccc62ad
</commit_message>
<xml_diff>
--- a/docs/Methods_R09.docx
+++ b/docs/Methods_R09.docx
@@ -524,14 +524,15 @@
             <w:tcW w:type="dxa" w:w="2160"/>
           </w:tcPr>
           <w:p>
-            <w:r/>
+            <w:r>
+              <w:t>ccc62ad</w:t>
+            </w:r>
             <w:r>
               <w:rPr>
                 <w:rFonts w:ascii="Times New Roman" w:hAnsi="Times New Roman"/>
                 <w:color w:val="000000"/>
                 <w:sz w:val="18"/>
               </w:rPr>
-              <w:t>[INSERT COMMIT HASH]</w:t>
             </w:r>
           </w:p>
         </w:tc>
@@ -2887,7 +2888,7 @@
           <w:color w:val="000000"/>
           <w:sz w:val="24"/>
         </w:rPr>
-        <w:t>The full pipeline (kab_pipeline.py), both fold-level exports, summary_results.json and shap_importance.json are provided. The repository is to be made accessible to the verifier with the commit hash recorded here: [INSERT COMMIT HASH]. Until the repository is accessible, full reproducibility cannot be independently confirmed; this is a stated limitation. The KNUST dataset is restricted under HuSSREC terms; the Alzubaidi dataset is public at doi:10.17632/fbs9mgmh4y.3.</w:t>
+        <w:t>The full pipeline (kab_pipeline.py), both fold-level exports, summary_results.json and shap_importance.json are provided. The repository is to be made accessible to the verifier with the commit hash recorded here: ccc62ad069439628de77b98af63aa4c97c426899. Until the repository is accessible, full reproducibility cannot be independently confirmed; this is a stated limitation. The KNUST dataset is restricted under HuSSREC terms; the Alzubaidi dataset is public at doi:10.17632/fbs9mgmh4y.3.</w:t>
       </w:r>
     </w:p>
     <w:sectPr>

</xml_diff>